<commit_message>
feat: updated Technology Stack
</commit_message>
<xml_diff>
--- a/docs/System Design Document - Delposo.docx
+++ b/docs/System Design Document - Delposo.docx
@@ -8379,7 +8379,19 @@
         <w:rPr>
           <w:rFonts w:asciiTheme="majorHAnsi" w:hAnsiTheme="majorHAnsi"/>
         </w:rPr>
-        <w:t> React 18, TypeScript, Tailwind CSS, Axios</w:t>
+        <w:t xml:space="preserve"> React 18, </w:t>
+      </w:r>
+      <w:r>
+        <w:rPr>
+          <w:rFonts w:asciiTheme="majorHAnsi" w:hAnsiTheme="majorHAnsi"/>
+        </w:rPr>
+        <w:t>JavaScript</w:t>
+      </w:r>
+      <w:r>
+        <w:rPr>
+          <w:rFonts w:asciiTheme="majorHAnsi" w:hAnsiTheme="majorHAnsi"/>
+        </w:rPr>
+        <w:t>, CSS</w:t>
       </w:r>
     </w:p>
     <w:p>
@@ -16348,21 +16360,7 @@
             <w:rStyle w:val="Hyperlink"/>
             <w:rFonts w:ascii="Play" w:eastAsia="Play" w:hAnsi="Play" w:cs="Play"/>
           </w:rPr>
-          <w:t>https://www.figma.com/design/lCj1ZUfSxJdkcOJA7zUuj7/BoardingHub-Wireframe?m=auto&amp;t=8</w:t>
-        </w:r>
-        <w:r>
-          <w:rPr>
-            <w:rStyle w:val="Hyperlink"/>
-            <w:rFonts w:ascii="Play" w:eastAsia="Play" w:hAnsi="Play" w:cs="Play"/>
-          </w:rPr>
-          <w:t>X</w:t>
-        </w:r>
-        <w:r>
-          <w:rPr>
-            <w:rStyle w:val="Hyperlink"/>
-            <w:rFonts w:ascii="Play" w:eastAsia="Play" w:hAnsi="Play" w:cs="Play"/>
-          </w:rPr>
-          <w:t>vnoiCea9LHWqsX-1</w:t>
+          <w:t>https://www.figma.com/design/lCj1ZUfSxJdkcOJA7zUuj7/BoardingHub-Wireframe?m=auto&amp;t=8XvnoiCea9LHWqsX-1</w:t>
         </w:r>
       </w:hyperlink>
     </w:p>
@@ -16415,6 +16413,7 @@
       <w:r>
         <w:rPr>
           <w:rFonts w:ascii="Play" w:eastAsia="Play" w:hAnsi="Play" w:cs="Play"/>
+          <w:noProof/>
         </w:rPr>
         <w:lastRenderedPageBreak/>
         <w:drawing>
@@ -16588,6 +16587,7 @@
           <w:rFonts w:ascii="Play" w:eastAsia="Play" w:hAnsi="Play" w:cs="Play"/>
           <w:b/>
           <w:bCs/>
+          <w:noProof/>
         </w:rPr>
         <w:drawing>
           <wp:inline distT="0" distB="0" distL="0" distR="0" wp14:anchorId="47C7E823" wp14:editId="2100763A">
@@ -16681,6 +16681,7 @@
           <w:rFonts w:ascii="Play" w:eastAsia="Play" w:hAnsi="Play" w:cs="Play"/>
           <w:b/>
           <w:bCs/>
+          <w:noProof/>
         </w:rPr>
         <w:lastRenderedPageBreak/>
         <w:drawing>
@@ -16912,6 +16913,7 @@
       <w:r>
         <w:rPr>
           <w:rFonts w:ascii="Play" w:eastAsia="Play" w:hAnsi="Play" w:cs="Play"/>
+          <w:noProof/>
         </w:rPr>
         <w:drawing>
           <wp:inline distT="0" distB="0" distL="0" distR="0" wp14:anchorId="6EC6BEC3" wp14:editId="3D66ACC2">
@@ -17042,39 +17044,7 @@
           <w:b/>
           <w:bCs/>
         </w:rPr>
-        <w:t>Mobile</w:t>
-      </w:r>
-      <w:r>
-        <w:rPr>
-          <w:rFonts w:ascii="Play" w:eastAsia="Play" w:hAnsi="Play" w:cs="Play"/>
-          <w:b/>
-          <w:bCs/>
-        </w:rPr>
-        <w:t xml:space="preserve"> Wireframe –</w:t>
-      </w:r>
-      <w:r>
-        <w:rPr>
-          <w:rFonts w:ascii="Play" w:eastAsia="Play" w:hAnsi="Play" w:cs="Play"/>
-          <w:b/>
-          <w:bCs/>
-        </w:rPr>
-        <w:t xml:space="preserve"> On</w:t>
-      </w:r>
-      <w:r>
-        <w:rPr>
-          <w:rFonts w:ascii="Play" w:eastAsia="Play" w:hAnsi="Play" w:cs="Play"/>
-          <w:b/>
-          <w:bCs/>
-        </w:rPr>
-        <w:t xml:space="preserve"> Page </w:t>
-      </w:r>
-      <w:r>
-        <w:rPr>
-          <w:rFonts w:ascii="Play" w:eastAsia="Play" w:hAnsi="Play" w:cs="Play"/>
-          <w:b/>
-          <w:bCs/>
-        </w:rPr>
-        <w:t>1</w:t>
+        <w:t>Mobile Wireframe – On Page 1</w:t>
       </w:r>
     </w:p>
     <w:p>
@@ -17171,6 +17141,7 @@
           <w:rFonts w:ascii="Play" w:eastAsia="Play" w:hAnsi="Play" w:cs="Play"/>
           <w:b/>
           <w:bCs/>
+          <w:noProof/>
         </w:rPr>
         <w:drawing>
           <wp:inline distT="0" distB="0" distL="0" distR="0" wp14:anchorId="1DA02375" wp14:editId="0DAF55A2">
@@ -17219,6 +17190,7 @@
           <w:rFonts w:ascii="Play" w:eastAsia="Play" w:hAnsi="Play" w:cs="Play"/>
           <w:b/>
           <w:bCs/>
+          <w:noProof/>
         </w:rPr>
         <w:drawing>
           <wp:inline distT="0" distB="0" distL="0" distR="0" wp14:anchorId="72ACBBB0" wp14:editId="4D2D9F72">
@@ -17445,31 +17417,7 @@
         <w:rPr>
           <w:rFonts w:ascii="Play" w:eastAsia="Play" w:hAnsi="Play" w:cs="Play"/>
         </w:rPr>
-        <w:t xml:space="preserve">Add </w:t>
-      </w:r>
-      <w:r>
-        <w:rPr>
-          <w:rFonts w:ascii="Play" w:eastAsia="Play" w:hAnsi="Play" w:cs="Play"/>
-        </w:rPr>
-        <w:t>room</w:t>
-      </w:r>
-      <w:r>
-        <w:rPr>
-          <w:rFonts w:ascii="Play" w:eastAsia="Play" w:hAnsi="Play" w:cs="Play"/>
-        </w:rPr>
-        <w:t xml:space="preserve"> – Forwards to </w:t>
-      </w:r>
-      <w:r>
-        <w:rPr>
-          <w:rFonts w:ascii="Play" w:eastAsia="Play" w:hAnsi="Play" w:cs="Play"/>
-        </w:rPr>
-        <w:t xml:space="preserve">Room </w:t>
-      </w:r>
-      <w:r>
-        <w:rPr>
-          <w:rFonts w:ascii="Play" w:eastAsia="Play" w:hAnsi="Play" w:cs="Play"/>
-        </w:rPr>
-        <w:t>Maker page</w:t>
+        <w:t>Add room – Forwards to Room Maker page</w:t>
       </w:r>
     </w:p>
     <w:p>
@@ -17644,6 +17592,7 @@
           <w:rFonts w:ascii="Play" w:eastAsia="Play" w:hAnsi="Play" w:cs="Play"/>
           <w:b/>
           <w:bCs/>
+          <w:noProof/>
         </w:rPr>
         <w:drawing>
           <wp:inline distT="0" distB="0" distL="0" distR="0" wp14:anchorId="72D8669E" wp14:editId="357BE551">
@@ -17692,6 +17641,7 @@
           <w:rFonts w:ascii="Play" w:eastAsia="Play" w:hAnsi="Play" w:cs="Play"/>
           <w:b/>
           <w:bCs/>
+          <w:noProof/>
         </w:rPr>
         <w:drawing>
           <wp:inline distT="0" distB="0" distL="0" distR="0" wp14:anchorId="04994A3B" wp14:editId="664AE0FB">
@@ -17898,6 +17848,7 @@
       <w:r>
         <w:rPr>
           <w:rFonts w:ascii="Play" w:eastAsia="Play" w:hAnsi="Play" w:cs="Play"/>
+          <w:noProof/>
         </w:rPr>
         <w:drawing>
           <wp:inline distT="0" distB="0" distL="0" distR="0" wp14:anchorId="2E42F2DD" wp14:editId="5AEA4598">
@@ -17944,6 +17895,7 @@
       <w:r>
         <w:rPr>
           <w:rFonts w:ascii="Play" w:eastAsia="Play" w:hAnsi="Play" w:cs="Play"/>
+          <w:noProof/>
         </w:rPr>
         <w:drawing>
           <wp:inline distT="0" distB="0" distL="0" distR="0" wp14:anchorId="79DE438D" wp14:editId="1DB9268A">
@@ -18063,6 +18015,7 @@
           <w:rFonts w:ascii="Play" w:eastAsia="Play" w:hAnsi="Play" w:cs="Play"/>
           <w:b/>
           <w:bCs/>
+          <w:noProof/>
         </w:rPr>
         <w:drawing>
           <wp:inline distT="0" distB="0" distL="0" distR="0" wp14:anchorId="020DB43E" wp14:editId="33994DA2">
@@ -18111,6 +18064,7 @@
           <w:rFonts w:ascii="Play" w:eastAsia="Play" w:hAnsi="Play" w:cs="Play"/>
           <w:b/>
           <w:bCs/>
+          <w:noProof/>
         </w:rPr>
         <w:drawing>
           <wp:inline distT="0" distB="0" distL="0" distR="0" wp14:anchorId="12851643" wp14:editId="52E94E9B">
@@ -30830,6 +30784,7 @@
   <w:style w:type="character" w:default="1" w:styleId="DefaultParagraphFont">
     <w:name w:val="Default Paragraph Font"/>
     <w:uiPriority w:val="1"/>
+    <w:semiHidden/>
     <w:unhideWhenUsed/>
   </w:style>
   <w:style w:type="table" w:default="1" w:styleId="TableNormal">

</xml_diff>